<commit_message>
Agrega documentacion de casos de prueba
</commit_message>
<xml_diff>
--- a/docs/Casos_de_Prueba.docx
+++ b/docs/Casos_de_Prueba.docx
@@ -2092,7 +2092,18 @@
                 <w:lang w:eastAsia="es-ES"/>
                 <w14:ligatures w14:val="none"/>
               </w:rPr>
-              <w:t>CP-003</w:t>
+              <w:t>CP-00</w:t>
+            </w:r>
+            <w:r>
+              <w:rPr>
+                <w:rFonts w:ascii="Times New Roman" w:eastAsia="Times New Roman" w:hAnsi="Times New Roman" w:cs="Times New Roman"/>
+                <w:kern w:val="0"/>
+                <w:sz w:val="24"/>
+                <w:szCs w:val="24"/>
+                <w:lang w:eastAsia="es-ES"/>
+                <w14:ligatures w14:val="none"/>
+              </w:rPr>
+              <w:t>4</w:t>
             </w:r>
           </w:p>
         </w:tc>
@@ -2439,7 +2450,29 @@
                 <w:lang w:eastAsia="es-ES"/>
                 <w14:ligatures w14:val="none"/>
               </w:rPr>
-              <w:t>CP-003-acceso-sin-sesion.png</w:t>
+              <w:t>CP-00</w:t>
+            </w:r>
+            <w:r>
+              <w:rPr>
+                <w:rFonts w:ascii="Times New Roman" w:eastAsia="Times New Roman" w:hAnsi="Times New Roman" w:cs="Times New Roman"/>
+                <w:kern w:val="0"/>
+                <w:sz w:val="24"/>
+                <w:szCs w:val="24"/>
+                <w:lang w:eastAsia="es-ES"/>
+                <w14:ligatures w14:val="none"/>
+              </w:rPr>
+              <w:t>4</w:t>
+            </w:r>
+            <w:r>
+              <w:rPr>
+                <w:rFonts w:ascii="Times New Roman" w:eastAsia="Times New Roman" w:hAnsi="Times New Roman" w:cs="Times New Roman"/>
+                <w:kern w:val="0"/>
+                <w:sz w:val="24"/>
+                <w:szCs w:val="24"/>
+                <w:lang w:eastAsia="es-ES"/>
+                <w14:ligatures w14:val="none"/>
+              </w:rPr>
+              <w:t>-acceso-sin-sesion.png</w:t>
             </w:r>
           </w:p>
         </w:tc>
@@ -2464,6 +2497,16 @@
         <w:tabs>
           <w:tab w:val="left" w:pos="5180"/>
         </w:tabs>
+        <w:rPr>
+          <w:rFonts w:ascii="Times New Roman" w:eastAsia="Times New Roman" w:hAnsi="Times New Roman" w:cs="Times New Roman"/>
+          <w:b/>
+          <w:bCs/>
+          <w:kern w:val="0"/>
+          <w:sz w:val="24"/>
+          <w:szCs w:val="24"/>
+          <w:lang w:eastAsia="es-ES"/>
+          <w14:ligatures w14:val="none"/>
+        </w:rPr>
       </w:pPr>
       <w:r>
         <w:rPr>
@@ -2482,6 +2525,1995 @@
                 <pic:pic xmlns:pic="http://schemas.openxmlformats.org/drawingml/2006/picture">
                   <pic:nvPicPr>
                     <pic:cNvPr id="0" name="Picture 1"/>
+                    <pic:cNvPicPr>
+                      <a:picLocks noChangeAspect="1" noChangeArrowheads="1"/>
+                    </pic:cNvPicPr>
+                  </pic:nvPicPr>
+                  <pic:blipFill>
+                    <a:blip r:embed="rId9" cstate="print">
+                      <a:extLst>
+                        <a:ext uri="{28A0092B-C50C-407E-A947-70E740481C1C}">
+                          <a14:useLocalDpi xmlns:a14="http://schemas.microsoft.com/office/drawing/2010/main" val="0"/>
+                        </a:ext>
+                      </a:extLst>
+                    </a:blip>
+                    <a:srcRect/>
+                    <a:stretch>
+                      <a:fillRect/>
+                    </a:stretch>
+                  </pic:blipFill>
+                  <pic:spPr bwMode="auto">
+                    <a:xfrm>
+                      <a:off x="0" y="0"/>
+                      <a:ext cx="5400040" cy="2694305"/>
+                    </a:xfrm>
+                    <a:prstGeom prst="rect">
+                      <a:avLst/>
+                    </a:prstGeom>
+                    <a:noFill/>
+                    <a:ln>
+                      <a:noFill/>
+                    </a:ln>
+                  </pic:spPr>
+                </pic:pic>
+              </a:graphicData>
+            </a:graphic>
+          </wp:inline>
+        </w:drawing>
+      </w:r>
+    </w:p>
+    <w:p/>
+    <w:p/>
+    <w:p/>
+    <w:p/>
+    <w:p/>
+    <w:p/>
+    <w:p/>
+    <w:p/>
+    <w:p/>
+    <w:p/>
+    <w:p>
+      <w:pPr>
+        <w:rPr>
+          <w:rFonts w:ascii="Times New Roman" w:eastAsia="Times New Roman" w:hAnsi="Times New Roman" w:cs="Times New Roman"/>
+          <w:b/>
+          <w:bCs/>
+          <w:kern w:val="0"/>
+          <w:sz w:val="24"/>
+          <w:szCs w:val="24"/>
+          <w:lang w:eastAsia="es-ES"/>
+          <w14:ligatures w14:val="none"/>
+        </w:rPr>
+      </w:pPr>
+    </w:p>
+    <w:p>
+      <w:pPr>
+        <w:tabs>
+          <w:tab w:val="left" w:pos="3600"/>
+        </w:tabs>
+      </w:pPr>
+      <w:r>
+        <w:tab/>
+      </w:r>
+    </w:p>
+    <w:tbl>
+      <w:tblPr>
+        <w:tblW w:w="0" w:type="auto"/>
+        <w:tblCellSpacing w:w="15" w:type="dxa"/>
+        <w:tblBorders>
+          <w:top w:val="single" w:sz="4" w:space="0" w:color="auto"/>
+          <w:left w:val="single" w:sz="4" w:space="0" w:color="auto"/>
+          <w:bottom w:val="single" w:sz="4" w:space="0" w:color="auto"/>
+          <w:right w:val="single" w:sz="4" w:space="0" w:color="auto"/>
+          <w:insideH w:val="single" w:sz="4" w:space="0" w:color="auto"/>
+          <w:insideV w:val="single" w:sz="4" w:space="0" w:color="auto"/>
+        </w:tblBorders>
+        <w:tblCellMar>
+          <w:top w:w="15" w:type="dxa"/>
+          <w:left w:w="15" w:type="dxa"/>
+          <w:bottom w:w="15" w:type="dxa"/>
+          <w:right w:w="15" w:type="dxa"/>
+        </w:tblCellMar>
+        <w:tblLook w:val="04A0" w:firstRow="1" w:lastRow="0" w:firstColumn="1" w:lastColumn="0" w:noHBand="0" w:noVBand="1"/>
+      </w:tblPr>
+      <w:tblGrid>
+        <w:gridCol w:w="1921"/>
+        <w:gridCol w:w="6573"/>
+      </w:tblGrid>
+      <w:tr>
+        <w:trPr>
+          <w:tblHeader/>
+          <w:tblCellSpacing w:w="15" w:type="dxa"/>
+        </w:trPr>
+        <w:tc>
+          <w:tcPr>
+            <w:tcW w:w="0" w:type="auto"/>
+            <w:vAlign w:val="center"/>
+            <w:hideMark/>
+          </w:tcPr>
+          <w:p>
+            <w:pPr>
+              <w:spacing w:after="0" w:line="240" w:lineRule="auto"/>
+              <w:jc w:val="center"/>
+              <w:rPr>
+                <w:rFonts w:ascii="Times New Roman" w:eastAsia="Times New Roman" w:hAnsi="Times New Roman" w:cs="Times New Roman"/>
+                <w:b/>
+                <w:bCs/>
+                <w:kern w:val="0"/>
+                <w:sz w:val="24"/>
+                <w:szCs w:val="24"/>
+                <w:lang w:eastAsia="es-ES"/>
+                <w14:ligatures w14:val="none"/>
+              </w:rPr>
+            </w:pPr>
+            <w:r>
+              <w:rPr>
+                <w:rFonts w:ascii="Times New Roman" w:eastAsia="Times New Roman" w:hAnsi="Times New Roman" w:cs="Times New Roman"/>
+                <w:b/>
+                <w:bCs/>
+                <w:kern w:val="0"/>
+                <w:sz w:val="24"/>
+                <w:szCs w:val="24"/>
+                <w:lang w:eastAsia="es-ES"/>
+                <w14:ligatures w14:val="none"/>
+              </w:rPr>
+              <w:lastRenderedPageBreak/>
+              <w:t>Campo</w:t>
+            </w:r>
+          </w:p>
+        </w:tc>
+        <w:tc>
+          <w:tcPr>
+            <w:tcW w:w="0" w:type="auto"/>
+            <w:vAlign w:val="center"/>
+            <w:hideMark/>
+          </w:tcPr>
+          <w:p>
+            <w:pPr>
+              <w:spacing w:after="0" w:line="240" w:lineRule="auto"/>
+              <w:jc w:val="center"/>
+              <w:rPr>
+                <w:rFonts w:ascii="Times New Roman" w:eastAsia="Times New Roman" w:hAnsi="Times New Roman" w:cs="Times New Roman"/>
+                <w:b/>
+                <w:bCs/>
+                <w:kern w:val="0"/>
+                <w:sz w:val="24"/>
+                <w:szCs w:val="24"/>
+                <w:lang w:eastAsia="es-ES"/>
+                <w14:ligatures w14:val="none"/>
+              </w:rPr>
+            </w:pPr>
+            <w:r>
+              <w:rPr>
+                <w:rFonts w:ascii="Times New Roman" w:eastAsia="Times New Roman" w:hAnsi="Times New Roman" w:cs="Times New Roman"/>
+                <w:b/>
+                <w:bCs/>
+                <w:kern w:val="0"/>
+                <w:sz w:val="24"/>
+                <w:szCs w:val="24"/>
+                <w:lang w:eastAsia="es-ES"/>
+                <w14:ligatures w14:val="none"/>
+              </w:rPr>
+              <w:t>Información</w:t>
+            </w:r>
+          </w:p>
+        </w:tc>
+      </w:tr>
+      <w:tr>
+        <w:trPr>
+          <w:tblCellSpacing w:w="15" w:type="dxa"/>
+        </w:trPr>
+        <w:tc>
+          <w:tcPr>
+            <w:tcW w:w="0" w:type="auto"/>
+            <w:vAlign w:val="center"/>
+            <w:hideMark/>
+          </w:tcPr>
+          <w:p>
+            <w:pPr>
+              <w:spacing w:after="0" w:line="240" w:lineRule="auto"/>
+              <w:rPr>
+                <w:rFonts w:ascii="Times New Roman" w:eastAsia="Times New Roman" w:hAnsi="Times New Roman" w:cs="Times New Roman"/>
+                <w:kern w:val="0"/>
+                <w:sz w:val="24"/>
+                <w:szCs w:val="24"/>
+                <w:lang w:eastAsia="es-ES"/>
+                <w14:ligatures w14:val="none"/>
+              </w:rPr>
+            </w:pPr>
+            <w:r>
+              <w:rPr>
+                <w:rFonts w:ascii="Times New Roman" w:eastAsia="Times New Roman" w:hAnsi="Times New Roman" w:cs="Times New Roman"/>
+                <w:b/>
+                <w:bCs/>
+                <w:kern w:val="0"/>
+                <w:sz w:val="24"/>
+                <w:szCs w:val="24"/>
+                <w:lang w:eastAsia="es-ES"/>
+                <w14:ligatures w14:val="none"/>
+              </w:rPr>
+              <w:t>Caso de prueba</w:t>
+            </w:r>
+          </w:p>
+        </w:tc>
+        <w:tc>
+          <w:tcPr>
+            <w:tcW w:w="0" w:type="auto"/>
+            <w:vAlign w:val="center"/>
+            <w:hideMark/>
+          </w:tcPr>
+          <w:p>
+            <w:pPr>
+              <w:spacing w:after="0" w:line="240" w:lineRule="auto"/>
+              <w:rPr>
+                <w:rFonts w:ascii="Times New Roman" w:eastAsia="Times New Roman" w:hAnsi="Times New Roman" w:cs="Times New Roman"/>
+                <w:kern w:val="0"/>
+                <w:sz w:val="24"/>
+                <w:szCs w:val="24"/>
+                <w:lang w:eastAsia="es-ES"/>
+                <w14:ligatures w14:val="none"/>
+              </w:rPr>
+            </w:pPr>
+            <w:r>
+              <w:rPr>
+                <w:rFonts w:ascii="Times New Roman" w:eastAsia="Times New Roman" w:hAnsi="Times New Roman" w:cs="Times New Roman"/>
+                <w:kern w:val="0"/>
+                <w:sz w:val="24"/>
+                <w:szCs w:val="24"/>
+                <w:lang w:eastAsia="es-ES"/>
+                <w14:ligatures w14:val="none"/>
+              </w:rPr>
+              <w:t>CP-00</w:t>
+            </w:r>
+            <w:r>
+              <w:rPr>
+                <w:rFonts w:ascii="Times New Roman" w:eastAsia="Times New Roman" w:hAnsi="Times New Roman" w:cs="Times New Roman"/>
+                <w:kern w:val="0"/>
+                <w:sz w:val="24"/>
+                <w:szCs w:val="24"/>
+                <w:lang w:eastAsia="es-ES"/>
+                <w14:ligatures w14:val="none"/>
+              </w:rPr>
+              <w:t>5</w:t>
+            </w:r>
+          </w:p>
+        </w:tc>
+      </w:tr>
+      <w:tr>
+        <w:trPr>
+          <w:tblCellSpacing w:w="15" w:type="dxa"/>
+        </w:trPr>
+        <w:tc>
+          <w:tcPr>
+            <w:tcW w:w="0" w:type="auto"/>
+            <w:vAlign w:val="center"/>
+            <w:hideMark/>
+          </w:tcPr>
+          <w:p>
+            <w:pPr>
+              <w:spacing w:after="0" w:line="240" w:lineRule="auto"/>
+              <w:rPr>
+                <w:rFonts w:ascii="Times New Roman" w:eastAsia="Times New Roman" w:hAnsi="Times New Roman" w:cs="Times New Roman"/>
+                <w:kern w:val="0"/>
+                <w:sz w:val="24"/>
+                <w:szCs w:val="24"/>
+                <w:lang w:eastAsia="es-ES"/>
+                <w14:ligatures w14:val="none"/>
+              </w:rPr>
+            </w:pPr>
+            <w:r>
+              <w:rPr>
+                <w:rFonts w:ascii="Times New Roman" w:eastAsia="Times New Roman" w:hAnsi="Times New Roman" w:cs="Times New Roman"/>
+                <w:b/>
+                <w:bCs/>
+                <w:kern w:val="0"/>
+                <w:sz w:val="24"/>
+                <w:szCs w:val="24"/>
+                <w:lang w:eastAsia="es-ES"/>
+                <w14:ligatures w14:val="none"/>
+              </w:rPr>
+              <w:t>Funcionalidad</w:t>
+            </w:r>
+          </w:p>
+        </w:tc>
+        <w:tc>
+          <w:tcPr>
+            <w:tcW w:w="0" w:type="auto"/>
+            <w:vAlign w:val="center"/>
+            <w:hideMark/>
+          </w:tcPr>
+          <w:p>
+            <w:pPr>
+              <w:spacing w:after="0" w:line="240" w:lineRule="auto"/>
+              <w:rPr>
+                <w:rFonts w:ascii="Times New Roman" w:eastAsia="Times New Roman" w:hAnsi="Times New Roman" w:cs="Times New Roman"/>
+                <w:kern w:val="0"/>
+                <w:sz w:val="24"/>
+                <w:szCs w:val="24"/>
+                <w:lang w:eastAsia="es-ES"/>
+                <w14:ligatures w14:val="none"/>
+              </w:rPr>
+            </w:pPr>
+            <w:r>
+              <w:rPr>
+                <w:rFonts w:ascii="Times New Roman" w:eastAsia="Times New Roman" w:hAnsi="Times New Roman" w:cs="Times New Roman"/>
+                <w:kern w:val="0"/>
+                <w:sz w:val="24"/>
+                <w:szCs w:val="24"/>
+                <w:lang w:eastAsia="es-ES"/>
+                <w14:ligatures w14:val="none"/>
+              </w:rPr>
+              <w:t>Validación de inicio de sesión</w:t>
+            </w:r>
+          </w:p>
+        </w:tc>
+      </w:tr>
+      <w:tr>
+        <w:trPr>
+          <w:tblCellSpacing w:w="15" w:type="dxa"/>
+        </w:trPr>
+        <w:tc>
+          <w:tcPr>
+            <w:tcW w:w="0" w:type="auto"/>
+            <w:vAlign w:val="center"/>
+            <w:hideMark/>
+          </w:tcPr>
+          <w:p>
+            <w:pPr>
+              <w:spacing w:after="0" w:line="240" w:lineRule="auto"/>
+              <w:rPr>
+                <w:rFonts w:ascii="Times New Roman" w:eastAsia="Times New Roman" w:hAnsi="Times New Roman" w:cs="Times New Roman"/>
+                <w:kern w:val="0"/>
+                <w:sz w:val="24"/>
+                <w:szCs w:val="24"/>
+                <w:lang w:eastAsia="es-ES"/>
+                <w14:ligatures w14:val="none"/>
+              </w:rPr>
+            </w:pPr>
+            <w:r>
+              <w:rPr>
+                <w:rFonts w:ascii="Times New Roman" w:eastAsia="Times New Roman" w:hAnsi="Times New Roman" w:cs="Times New Roman"/>
+                <w:b/>
+                <w:bCs/>
+                <w:kern w:val="0"/>
+                <w:sz w:val="24"/>
+                <w:szCs w:val="24"/>
+                <w:lang w:eastAsia="es-ES"/>
+                <w14:ligatures w14:val="none"/>
+              </w:rPr>
+              <w:t>Resultado esperado</w:t>
+            </w:r>
+          </w:p>
+        </w:tc>
+        <w:tc>
+          <w:tcPr>
+            <w:tcW w:w="0" w:type="auto"/>
+            <w:vAlign w:val="center"/>
+            <w:hideMark/>
+          </w:tcPr>
+          <w:p>
+            <w:pPr>
+              <w:spacing w:after="0" w:line="240" w:lineRule="auto"/>
+              <w:rPr>
+                <w:rFonts w:ascii="Times New Roman" w:eastAsia="Times New Roman" w:hAnsi="Times New Roman" w:cs="Times New Roman"/>
+                <w:kern w:val="0"/>
+                <w:sz w:val="24"/>
+                <w:szCs w:val="24"/>
+                <w:lang w:eastAsia="es-ES"/>
+                <w14:ligatures w14:val="none"/>
+              </w:rPr>
+            </w:pPr>
+            <w:r>
+              <w:rPr>
+                <w:rFonts w:ascii="Times New Roman" w:eastAsia="Times New Roman" w:hAnsi="Times New Roman" w:cs="Times New Roman"/>
+                <w:kern w:val="0"/>
+                <w:sz w:val="24"/>
+                <w:szCs w:val="24"/>
+                <w:lang w:eastAsia="es-ES"/>
+                <w14:ligatures w14:val="none"/>
+              </w:rPr>
+              <w:t>El sistema debe rechazar las credenciales incorrectas y evitar el acceso al panel administrativo.</w:t>
+            </w:r>
+          </w:p>
+        </w:tc>
+      </w:tr>
+      <w:tr>
+        <w:trPr>
+          <w:tblCellSpacing w:w="15" w:type="dxa"/>
+        </w:trPr>
+        <w:tc>
+          <w:tcPr>
+            <w:tcW w:w="0" w:type="auto"/>
+            <w:vAlign w:val="center"/>
+            <w:hideMark/>
+          </w:tcPr>
+          <w:p>
+            <w:pPr>
+              <w:spacing w:after="0" w:line="240" w:lineRule="auto"/>
+              <w:rPr>
+                <w:rFonts w:ascii="Times New Roman" w:eastAsia="Times New Roman" w:hAnsi="Times New Roman" w:cs="Times New Roman"/>
+                <w:kern w:val="0"/>
+                <w:sz w:val="24"/>
+                <w:szCs w:val="24"/>
+                <w:lang w:eastAsia="es-ES"/>
+                <w14:ligatures w14:val="none"/>
+              </w:rPr>
+            </w:pPr>
+            <w:r>
+              <w:rPr>
+                <w:rFonts w:ascii="Times New Roman" w:eastAsia="Times New Roman" w:hAnsi="Times New Roman" w:cs="Times New Roman"/>
+                <w:b/>
+                <w:bCs/>
+                <w:kern w:val="0"/>
+                <w:sz w:val="24"/>
+                <w:szCs w:val="24"/>
+                <w:lang w:eastAsia="es-ES"/>
+                <w14:ligatures w14:val="none"/>
+              </w:rPr>
+              <w:t>Resultado obtenido</w:t>
+            </w:r>
+          </w:p>
+        </w:tc>
+        <w:tc>
+          <w:tcPr>
+            <w:tcW w:w="0" w:type="auto"/>
+            <w:vAlign w:val="center"/>
+            <w:hideMark/>
+          </w:tcPr>
+          <w:p>
+            <w:pPr>
+              <w:spacing w:after="0" w:line="240" w:lineRule="auto"/>
+              <w:rPr>
+                <w:rFonts w:ascii="Times New Roman" w:eastAsia="Times New Roman" w:hAnsi="Times New Roman" w:cs="Times New Roman"/>
+                <w:kern w:val="0"/>
+                <w:sz w:val="24"/>
+                <w:szCs w:val="24"/>
+                <w:lang w:eastAsia="es-ES"/>
+                <w14:ligatures w14:val="none"/>
+              </w:rPr>
+            </w:pPr>
+            <w:r>
+              <w:rPr>
+                <w:rFonts w:ascii="Times New Roman" w:eastAsia="Times New Roman" w:hAnsi="Times New Roman" w:cs="Times New Roman"/>
+                <w:kern w:val="0"/>
+                <w:sz w:val="24"/>
+                <w:szCs w:val="24"/>
+                <w:lang w:eastAsia="es-ES"/>
+                <w14:ligatures w14:val="none"/>
+              </w:rPr>
+              <w:t>El sistema rechazó las credenciales incorrectas y no permitió el acceso al panel administrativo.</w:t>
+            </w:r>
+          </w:p>
+        </w:tc>
+      </w:tr>
+      <w:tr>
+        <w:trPr>
+          <w:tblCellSpacing w:w="15" w:type="dxa"/>
+        </w:trPr>
+        <w:tc>
+          <w:tcPr>
+            <w:tcW w:w="0" w:type="auto"/>
+            <w:vAlign w:val="center"/>
+            <w:hideMark/>
+          </w:tcPr>
+          <w:p>
+            <w:pPr>
+              <w:spacing w:after="0" w:line="240" w:lineRule="auto"/>
+              <w:rPr>
+                <w:rFonts w:ascii="Times New Roman" w:eastAsia="Times New Roman" w:hAnsi="Times New Roman" w:cs="Times New Roman"/>
+                <w:kern w:val="0"/>
+                <w:sz w:val="24"/>
+                <w:szCs w:val="24"/>
+                <w:lang w:eastAsia="es-ES"/>
+                <w14:ligatures w14:val="none"/>
+              </w:rPr>
+            </w:pPr>
+            <w:r>
+              <w:rPr>
+                <w:rFonts w:ascii="Times New Roman" w:eastAsia="Times New Roman" w:hAnsi="Times New Roman" w:cs="Times New Roman"/>
+                <w:b/>
+                <w:bCs/>
+                <w:kern w:val="0"/>
+                <w:sz w:val="24"/>
+                <w:szCs w:val="24"/>
+                <w:lang w:eastAsia="es-ES"/>
+                <w14:ligatures w14:val="none"/>
+              </w:rPr>
+              <w:t>Estado</w:t>
+            </w:r>
+          </w:p>
+        </w:tc>
+        <w:tc>
+          <w:tcPr>
+            <w:tcW w:w="0" w:type="auto"/>
+            <w:vAlign w:val="center"/>
+            <w:hideMark/>
+          </w:tcPr>
+          <w:p>
+            <w:pPr>
+              <w:spacing w:after="0" w:line="240" w:lineRule="auto"/>
+              <w:rPr>
+                <w:rFonts w:ascii="Times New Roman" w:eastAsia="Times New Roman" w:hAnsi="Times New Roman" w:cs="Times New Roman"/>
+                <w:kern w:val="0"/>
+                <w:sz w:val="24"/>
+                <w:szCs w:val="24"/>
+                <w:lang w:eastAsia="es-ES"/>
+                <w14:ligatures w14:val="none"/>
+              </w:rPr>
+            </w:pPr>
+            <w:r>
+              <w:rPr>
+                <w:rFonts w:ascii="Times New Roman" w:eastAsia="Times New Roman" w:hAnsi="Times New Roman" w:cs="Times New Roman"/>
+                <w:b/>
+                <w:bCs/>
+                <w:kern w:val="0"/>
+                <w:sz w:val="24"/>
+                <w:szCs w:val="24"/>
+                <w:lang w:eastAsia="es-ES"/>
+                <w14:ligatures w14:val="none"/>
+              </w:rPr>
+              <w:t>APROBADO</w:t>
+            </w:r>
+          </w:p>
+        </w:tc>
+      </w:tr>
+      <w:tr>
+        <w:trPr>
+          <w:tblCellSpacing w:w="15" w:type="dxa"/>
+        </w:trPr>
+        <w:tc>
+          <w:tcPr>
+            <w:tcW w:w="0" w:type="auto"/>
+            <w:vAlign w:val="center"/>
+            <w:hideMark/>
+          </w:tcPr>
+          <w:p>
+            <w:pPr>
+              <w:spacing w:after="0" w:line="240" w:lineRule="auto"/>
+              <w:rPr>
+                <w:rFonts w:ascii="Times New Roman" w:eastAsia="Times New Roman" w:hAnsi="Times New Roman" w:cs="Times New Roman"/>
+                <w:kern w:val="0"/>
+                <w:sz w:val="24"/>
+                <w:szCs w:val="24"/>
+                <w:lang w:eastAsia="es-ES"/>
+                <w14:ligatures w14:val="none"/>
+              </w:rPr>
+            </w:pPr>
+            <w:r>
+              <w:rPr>
+                <w:rFonts w:ascii="Times New Roman" w:eastAsia="Times New Roman" w:hAnsi="Times New Roman" w:cs="Times New Roman"/>
+                <w:b/>
+                <w:bCs/>
+                <w:kern w:val="0"/>
+                <w:sz w:val="24"/>
+                <w:szCs w:val="24"/>
+                <w:lang w:eastAsia="es-ES"/>
+                <w14:ligatures w14:val="none"/>
+              </w:rPr>
+              <w:t>Evidencia</w:t>
+            </w:r>
+          </w:p>
+        </w:tc>
+        <w:tc>
+          <w:tcPr>
+            <w:tcW w:w="0" w:type="auto"/>
+            <w:vAlign w:val="center"/>
+            <w:hideMark/>
+          </w:tcPr>
+          <w:p>
+            <w:pPr>
+              <w:spacing w:after="0" w:line="240" w:lineRule="auto"/>
+              <w:rPr>
+                <w:rFonts w:ascii="Times New Roman" w:eastAsia="Times New Roman" w:hAnsi="Times New Roman" w:cs="Times New Roman"/>
+                <w:kern w:val="0"/>
+                <w:sz w:val="24"/>
+                <w:szCs w:val="24"/>
+                <w:lang w:eastAsia="es-ES"/>
+                <w14:ligatures w14:val="none"/>
+              </w:rPr>
+            </w:pPr>
+            <w:r>
+              <w:rPr>
+                <w:rFonts w:ascii="Times New Roman" w:eastAsia="Times New Roman" w:hAnsi="Times New Roman" w:cs="Times New Roman"/>
+                <w:kern w:val="0"/>
+                <w:sz w:val="24"/>
+                <w:szCs w:val="24"/>
+                <w:lang w:eastAsia="es-ES"/>
+                <w14:ligatures w14:val="none"/>
+              </w:rPr>
+              <w:t>CP-00</w:t>
+            </w:r>
+            <w:r>
+              <w:rPr>
+                <w:rFonts w:ascii="Times New Roman" w:eastAsia="Times New Roman" w:hAnsi="Times New Roman" w:cs="Times New Roman"/>
+                <w:kern w:val="0"/>
+                <w:sz w:val="24"/>
+                <w:szCs w:val="24"/>
+                <w:lang w:eastAsia="es-ES"/>
+                <w14:ligatures w14:val="none"/>
+              </w:rPr>
+              <w:t>5</w:t>
+            </w:r>
+            <w:r>
+              <w:rPr>
+                <w:rFonts w:ascii="Times New Roman" w:eastAsia="Times New Roman" w:hAnsi="Times New Roman" w:cs="Times New Roman"/>
+                <w:kern w:val="0"/>
+                <w:sz w:val="24"/>
+                <w:szCs w:val="24"/>
+                <w:lang w:eastAsia="es-ES"/>
+                <w14:ligatures w14:val="none"/>
+              </w:rPr>
+              <w:t>-inicio-sesion-datos-incorrectos.png</w:t>
+            </w:r>
+          </w:p>
+        </w:tc>
+      </w:tr>
+    </w:tbl>
+    <w:p>
+      <w:pPr>
+        <w:tabs>
+          <w:tab w:val="left" w:pos="3600"/>
+        </w:tabs>
+      </w:pPr>
+    </w:p>
+    <w:p>
+      <w:pPr>
+        <w:pStyle w:val="NormalWeb"/>
+      </w:pPr>
+      <w:r>
+        <w:rPr>
+          <w:noProof/>
+        </w:rPr>
+        <w:drawing>
+          <wp:inline distT="0" distB="0" distL="0" distR="0" wp14:anchorId="03C27E97" wp14:editId="041F366F">
+            <wp:extent cx="5400040" cy="3268980"/>
+            <wp:effectExtent l="0" t="0" r="0" b="7620"/>
+            <wp:docPr id="1018945902" name="Imagen 1"/>
+            <wp:cNvGraphicFramePr>
+              <a:graphicFrameLocks xmlns:a="http://schemas.openxmlformats.org/drawingml/2006/main" noChangeAspect="1"/>
+            </wp:cNvGraphicFramePr>
+            <a:graphic xmlns:a="http://schemas.openxmlformats.org/drawingml/2006/main">
+              <a:graphicData uri="http://schemas.openxmlformats.org/drawingml/2006/picture">
+                <pic:pic xmlns:pic="http://schemas.openxmlformats.org/drawingml/2006/picture">
+                  <pic:nvPicPr>
+                    <pic:cNvPr id="0" name="Picture 1"/>
+                    <pic:cNvPicPr>
+                      <a:picLocks noChangeAspect="1" noChangeArrowheads="1"/>
+                    </pic:cNvPicPr>
+                  </pic:nvPicPr>
+                  <pic:blipFill>
+                    <a:blip r:embed="rId10" cstate="print">
+                      <a:extLst>
+                        <a:ext uri="{28A0092B-C50C-407E-A947-70E740481C1C}">
+                          <a14:useLocalDpi xmlns:a14="http://schemas.microsoft.com/office/drawing/2010/main" val="0"/>
+                        </a:ext>
+                      </a:extLst>
+                    </a:blip>
+                    <a:srcRect/>
+                    <a:stretch>
+                      <a:fillRect/>
+                    </a:stretch>
+                  </pic:blipFill>
+                  <pic:spPr bwMode="auto">
+                    <a:xfrm>
+                      <a:off x="0" y="0"/>
+                      <a:ext cx="5400040" cy="3268980"/>
+                    </a:xfrm>
+                    <a:prstGeom prst="rect">
+                      <a:avLst/>
+                    </a:prstGeom>
+                    <a:noFill/>
+                    <a:ln>
+                      <a:noFill/>
+                    </a:ln>
+                  </pic:spPr>
+                </pic:pic>
+              </a:graphicData>
+            </a:graphic>
+          </wp:inline>
+        </w:drawing>
+      </w:r>
+    </w:p>
+    <w:p>
+      <w:pPr>
+        <w:tabs>
+          <w:tab w:val="left" w:pos="3600"/>
+        </w:tabs>
+      </w:pPr>
+    </w:p>
+    <w:p>
+      <w:pPr>
+        <w:tabs>
+          <w:tab w:val="left" w:pos="3600"/>
+        </w:tabs>
+      </w:pPr>
+    </w:p>
+    <w:p>
+      <w:pPr>
+        <w:tabs>
+          <w:tab w:val="left" w:pos="3600"/>
+        </w:tabs>
+      </w:pPr>
+    </w:p>
+    <w:tbl>
+      <w:tblPr>
+        <w:tblW w:w="0" w:type="auto"/>
+        <w:tblCellSpacing w:w="15" w:type="dxa"/>
+        <w:tblBorders>
+          <w:top w:val="single" w:sz="4" w:space="0" w:color="auto"/>
+          <w:left w:val="single" w:sz="4" w:space="0" w:color="auto"/>
+          <w:bottom w:val="single" w:sz="4" w:space="0" w:color="auto"/>
+          <w:right w:val="single" w:sz="4" w:space="0" w:color="auto"/>
+          <w:insideH w:val="single" w:sz="4" w:space="0" w:color="auto"/>
+          <w:insideV w:val="single" w:sz="4" w:space="0" w:color="auto"/>
+        </w:tblBorders>
+        <w:tblCellMar>
+          <w:top w:w="15" w:type="dxa"/>
+          <w:left w:w="15" w:type="dxa"/>
+          <w:bottom w:w="15" w:type="dxa"/>
+          <w:right w:w="15" w:type="dxa"/>
+        </w:tblCellMar>
+        <w:tblLook w:val="04A0" w:firstRow="1" w:lastRow="0" w:firstColumn="1" w:lastColumn="0" w:noHBand="0" w:noVBand="1"/>
+      </w:tblPr>
+      <w:tblGrid>
+        <w:gridCol w:w="1915"/>
+        <w:gridCol w:w="6579"/>
+      </w:tblGrid>
+      <w:tr>
+        <w:trPr>
+          <w:tblHeader/>
+          <w:tblCellSpacing w:w="15" w:type="dxa"/>
+        </w:trPr>
+        <w:tc>
+          <w:tcPr>
+            <w:tcW w:w="0" w:type="auto"/>
+            <w:vAlign w:val="center"/>
+            <w:hideMark/>
+          </w:tcPr>
+          <w:p>
+            <w:pPr>
+              <w:spacing w:after="0" w:line="240" w:lineRule="auto"/>
+              <w:jc w:val="center"/>
+              <w:rPr>
+                <w:rFonts w:ascii="Times New Roman" w:eastAsia="Times New Roman" w:hAnsi="Times New Roman" w:cs="Times New Roman"/>
+                <w:b/>
+                <w:bCs/>
+                <w:kern w:val="0"/>
+                <w:sz w:val="24"/>
+                <w:szCs w:val="24"/>
+                <w:lang w:eastAsia="es-ES"/>
+                <w14:ligatures w14:val="none"/>
+              </w:rPr>
+            </w:pPr>
+            <w:r>
+              <w:rPr>
+                <w:rFonts w:ascii="Times New Roman" w:eastAsia="Times New Roman" w:hAnsi="Times New Roman" w:cs="Times New Roman"/>
+                <w:b/>
+                <w:bCs/>
+                <w:kern w:val="0"/>
+                <w:sz w:val="24"/>
+                <w:szCs w:val="24"/>
+                <w:lang w:eastAsia="es-ES"/>
+                <w14:ligatures w14:val="none"/>
+              </w:rPr>
+              <w:t>Campo</w:t>
+            </w:r>
+          </w:p>
+        </w:tc>
+        <w:tc>
+          <w:tcPr>
+            <w:tcW w:w="0" w:type="auto"/>
+            <w:vAlign w:val="center"/>
+            <w:hideMark/>
+          </w:tcPr>
+          <w:p>
+            <w:pPr>
+              <w:spacing w:after="0" w:line="240" w:lineRule="auto"/>
+              <w:jc w:val="center"/>
+              <w:rPr>
+                <w:rFonts w:ascii="Times New Roman" w:eastAsia="Times New Roman" w:hAnsi="Times New Roman" w:cs="Times New Roman"/>
+                <w:b/>
+                <w:bCs/>
+                <w:kern w:val="0"/>
+                <w:sz w:val="24"/>
+                <w:szCs w:val="24"/>
+                <w:lang w:eastAsia="es-ES"/>
+                <w14:ligatures w14:val="none"/>
+              </w:rPr>
+            </w:pPr>
+            <w:r>
+              <w:rPr>
+                <w:rFonts w:ascii="Times New Roman" w:eastAsia="Times New Roman" w:hAnsi="Times New Roman" w:cs="Times New Roman"/>
+                <w:b/>
+                <w:bCs/>
+                <w:kern w:val="0"/>
+                <w:sz w:val="24"/>
+                <w:szCs w:val="24"/>
+                <w:lang w:eastAsia="es-ES"/>
+                <w14:ligatures w14:val="none"/>
+              </w:rPr>
+              <w:t>Información</w:t>
+            </w:r>
+          </w:p>
+        </w:tc>
+      </w:tr>
+      <w:tr>
+        <w:trPr>
+          <w:tblCellSpacing w:w="15" w:type="dxa"/>
+        </w:trPr>
+        <w:tc>
+          <w:tcPr>
+            <w:tcW w:w="0" w:type="auto"/>
+            <w:vAlign w:val="center"/>
+            <w:hideMark/>
+          </w:tcPr>
+          <w:p>
+            <w:pPr>
+              <w:spacing w:after="0" w:line="240" w:lineRule="auto"/>
+              <w:rPr>
+                <w:rFonts w:ascii="Times New Roman" w:eastAsia="Times New Roman" w:hAnsi="Times New Roman" w:cs="Times New Roman"/>
+                <w:kern w:val="0"/>
+                <w:sz w:val="24"/>
+                <w:szCs w:val="24"/>
+                <w:lang w:eastAsia="es-ES"/>
+                <w14:ligatures w14:val="none"/>
+              </w:rPr>
+            </w:pPr>
+            <w:r>
+              <w:rPr>
+                <w:rFonts w:ascii="Times New Roman" w:eastAsia="Times New Roman" w:hAnsi="Times New Roman" w:cs="Times New Roman"/>
+                <w:b/>
+                <w:bCs/>
+                <w:kern w:val="0"/>
+                <w:sz w:val="24"/>
+                <w:szCs w:val="24"/>
+                <w:lang w:eastAsia="es-ES"/>
+                <w14:ligatures w14:val="none"/>
+              </w:rPr>
+              <w:t>Caso de prueba</w:t>
+            </w:r>
+          </w:p>
+        </w:tc>
+        <w:tc>
+          <w:tcPr>
+            <w:tcW w:w="0" w:type="auto"/>
+            <w:vAlign w:val="center"/>
+            <w:hideMark/>
+          </w:tcPr>
+          <w:p>
+            <w:pPr>
+              <w:spacing w:after="0" w:line="240" w:lineRule="auto"/>
+              <w:rPr>
+                <w:rFonts w:ascii="Times New Roman" w:eastAsia="Times New Roman" w:hAnsi="Times New Roman" w:cs="Times New Roman"/>
+                <w:kern w:val="0"/>
+                <w:sz w:val="24"/>
+                <w:szCs w:val="24"/>
+                <w:lang w:eastAsia="es-ES"/>
+                <w14:ligatures w14:val="none"/>
+              </w:rPr>
+            </w:pPr>
+            <w:r>
+              <w:rPr>
+                <w:rFonts w:ascii="Times New Roman" w:eastAsia="Times New Roman" w:hAnsi="Times New Roman" w:cs="Times New Roman"/>
+                <w:kern w:val="0"/>
+                <w:sz w:val="24"/>
+                <w:szCs w:val="24"/>
+                <w:lang w:eastAsia="es-ES"/>
+                <w14:ligatures w14:val="none"/>
+              </w:rPr>
+              <w:t>CP-00</w:t>
+            </w:r>
+            <w:r>
+              <w:rPr>
+                <w:rFonts w:ascii="Times New Roman" w:eastAsia="Times New Roman" w:hAnsi="Times New Roman" w:cs="Times New Roman"/>
+                <w:kern w:val="0"/>
+                <w:sz w:val="24"/>
+                <w:szCs w:val="24"/>
+                <w:lang w:eastAsia="es-ES"/>
+                <w14:ligatures w14:val="none"/>
+              </w:rPr>
+              <w:t>6</w:t>
+            </w:r>
+          </w:p>
+        </w:tc>
+      </w:tr>
+      <w:tr>
+        <w:trPr>
+          <w:tblCellSpacing w:w="15" w:type="dxa"/>
+        </w:trPr>
+        <w:tc>
+          <w:tcPr>
+            <w:tcW w:w="0" w:type="auto"/>
+            <w:vAlign w:val="center"/>
+            <w:hideMark/>
+          </w:tcPr>
+          <w:p>
+            <w:pPr>
+              <w:spacing w:after="0" w:line="240" w:lineRule="auto"/>
+              <w:rPr>
+                <w:rFonts w:ascii="Times New Roman" w:eastAsia="Times New Roman" w:hAnsi="Times New Roman" w:cs="Times New Roman"/>
+                <w:kern w:val="0"/>
+                <w:sz w:val="24"/>
+                <w:szCs w:val="24"/>
+                <w:lang w:eastAsia="es-ES"/>
+                <w14:ligatures w14:val="none"/>
+              </w:rPr>
+            </w:pPr>
+            <w:r>
+              <w:rPr>
+                <w:rFonts w:ascii="Times New Roman" w:eastAsia="Times New Roman" w:hAnsi="Times New Roman" w:cs="Times New Roman"/>
+                <w:b/>
+                <w:bCs/>
+                <w:kern w:val="0"/>
+                <w:sz w:val="24"/>
+                <w:szCs w:val="24"/>
+                <w:lang w:eastAsia="es-ES"/>
+                <w14:ligatures w14:val="none"/>
+              </w:rPr>
+              <w:t>Funcionalidad</w:t>
+            </w:r>
+          </w:p>
+        </w:tc>
+        <w:tc>
+          <w:tcPr>
+            <w:tcW w:w="0" w:type="auto"/>
+            <w:vAlign w:val="center"/>
+            <w:hideMark/>
+          </w:tcPr>
+          <w:p>
+            <w:pPr>
+              <w:spacing w:after="0" w:line="240" w:lineRule="auto"/>
+              <w:rPr>
+                <w:rFonts w:ascii="Times New Roman" w:eastAsia="Times New Roman" w:hAnsi="Times New Roman" w:cs="Times New Roman"/>
+                <w:kern w:val="0"/>
+                <w:sz w:val="24"/>
+                <w:szCs w:val="24"/>
+                <w:lang w:eastAsia="es-ES"/>
+                <w14:ligatures w14:val="none"/>
+              </w:rPr>
+            </w:pPr>
+            <w:r>
+              <w:rPr>
+                <w:rFonts w:ascii="Times New Roman" w:eastAsia="Times New Roman" w:hAnsi="Times New Roman" w:cs="Times New Roman"/>
+                <w:kern w:val="0"/>
+                <w:sz w:val="24"/>
+                <w:szCs w:val="24"/>
+                <w:lang w:eastAsia="es-ES"/>
+                <w14:ligatures w14:val="none"/>
+              </w:rPr>
+              <w:t>Cierre de sesión</w:t>
+            </w:r>
+          </w:p>
+        </w:tc>
+      </w:tr>
+      <w:tr>
+        <w:trPr>
+          <w:tblCellSpacing w:w="15" w:type="dxa"/>
+        </w:trPr>
+        <w:tc>
+          <w:tcPr>
+            <w:tcW w:w="0" w:type="auto"/>
+            <w:vAlign w:val="center"/>
+            <w:hideMark/>
+          </w:tcPr>
+          <w:p>
+            <w:pPr>
+              <w:spacing w:after="0" w:line="240" w:lineRule="auto"/>
+              <w:rPr>
+                <w:rFonts w:ascii="Times New Roman" w:eastAsia="Times New Roman" w:hAnsi="Times New Roman" w:cs="Times New Roman"/>
+                <w:kern w:val="0"/>
+                <w:sz w:val="24"/>
+                <w:szCs w:val="24"/>
+                <w:lang w:eastAsia="es-ES"/>
+                <w14:ligatures w14:val="none"/>
+              </w:rPr>
+            </w:pPr>
+            <w:r>
+              <w:rPr>
+                <w:rFonts w:ascii="Times New Roman" w:eastAsia="Times New Roman" w:hAnsi="Times New Roman" w:cs="Times New Roman"/>
+                <w:b/>
+                <w:bCs/>
+                <w:kern w:val="0"/>
+                <w:sz w:val="24"/>
+                <w:szCs w:val="24"/>
+                <w:lang w:eastAsia="es-ES"/>
+                <w14:ligatures w14:val="none"/>
+              </w:rPr>
+              <w:t>Resultado esperado</w:t>
+            </w:r>
+          </w:p>
+        </w:tc>
+        <w:tc>
+          <w:tcPr>
+            <w:tcW w:w="0" w:type="auto"/>
+            <w:vAlign w:val="center"/>
+            <w:hideMark/>
+          </w:tcPr>
+          <w:p>
+            <w:pPr>
+              <w:spacing w:after="0" w:line="240" w:lineRule="auto"/>
+              <w:rPr>
+                <w:rFonts w:ascii="Times New Roman" w:eastAsia="Times New Roman" w:hAnsi="Times New Roman" w:cs="Times New Roman"/>
+                <w:kern w:val="0"/>
+                <w:sz w:val="24"/>
+                <w:szCs w:val="24"/>
+                <w:lang w:eastAsia="es-ES"/>
+                <w14:ligatures w14:val="none"/>
+              </w:rPr>
+            </w:pPr>
+            <w:r>
+              <w:rPr>
+                <w:rFonts w:ascii="Times New Roman" w:eastAsia="Times New Roman" w:hAnsi="Times New Roman" w:cs="Times New Roman"/>
+                <w:kern w:val="0"/>
+                <w:sz w:val="24"/>
+                <w:szCs w:val="24"/>
+                <w:lang w:eastAsia="es-ES"/>
+                <w14:ligatures w14:val="none"/>
+              </w:rPr>
+              <w:t>El sistema debe cerrar la sesión del usuario y mostrar una confirmación de que la sesión terminó.</w:t>
+            </w:r>
+          </w:p>
+        </w:tc>
+      </w:tr>
+      <w:tr>
+        <w:trPr>
+          <w:tblCellSpacing w:w="15" w:type="dxa"/>
+        </w:trPr>
+        <w:tc>
+          <w:tcPr>
+            <w:tcW w:w="0" w:type="auto"/>
+            <w:vAlign w:val="center"/>
+            <w:hideMark/>
+          </w:tcPr>
+          <w:p>
+            <w:pPr>
+              <w:spacing w:after="0" w:line="240" w:lineRule="auto"/>
+              <w:rPr>
+                <w:rFonts w:ascii="Times New Roman" w:eastAsia="Times New Roman" w:hAnsi="Times New Roman" w:cs="Times New Roman"/>
+                <w:kern w:val="0"/>
+                <w:sz w:val="24"/>
+                <w:szCs w:val="24"/>
+                <w:lang w:eastAsia="es-ES"/>
+                <w14:ligatures w14:val="none"/>
+              </w:rPr>
+            </w:pPr>
+            <w:r>
+              <w:rPr>
+                <w:rFonts w:ascii="Times New Roman" w:eastAsia="Times New Roman" w:hAnsi="Times New Roman" w:cs="Times New Roman"/>
+                <w:b/>
+                <w:bCs/>
+                <w:kern w:val="0"/>
+                <w:sz w:val="24"/>
+                <w:szCs w:val="24"/>
+                <w:lang w:eastAsia="es-ES"/>
+                <w14:ligatures w14:val="none"/>
+              </w:rPr>
+              <w:t>Resultado obtenido</w:t>
+            </w:r>
+          </w:p>
+        </w:tc>
+        <w:tc>
+          <w:tcPr>
+            <w:tcW w:w="0" w:type="auto"/>
+            <w:vAlign w:val="center"/>
+            <w:hideMark/>
+          </w:tcPr>
+          <w:p>
+            <w:pPr>
+              <w:spacing w:after="0" w:line="240" w:lineRule="auto"/>
+              <w:rPr>
+                <w:rFonts w:ascii="Times New Roman" w:eastAsia="Times New Roman" w:hAnsi="Times New Roman" w:cs="Times New Roman"/>
+                <w:kern w:val="0"/>
+                <w:sz w:val="24"/>
+                <w:szCs w:val="24"/>
+                <w:lang w:eastAsia="es-ES"/>
+                <w14:ligatures w14:val="none"/>
+              </w:rPr>
+            </w:pPr>
+            <w:r>
+              <w:rPr>
+                <w:rFonts w:ascii="Times New Roman" w:eastAsia="Times New Roman" w:hAnsi="Times New Roman" w:cs="Times New Roman"/>
+                <w:kern w:val="0"/>
+                <w:sz w:val="24"/>
+                <w:szCs w:val="24"/>
+                <w:lang w:eastAsia="es-ES"/>
+                <w14:ligatures w14:val="none"/>
+              </w:rPr>
+              <w:t>El sistema mostró “Sesión terminada” y permitió iniciar sesión nuevamente.</w:t>
+            </w:r>
+          </w:p>
+        </w:tc>
+      </w:tr>
+      <w:tr>
+        <w:trPr>
+          <w:tblCellSpacing w:w="15" w:type="dxa"/>
+        </w:trPr>
+        <w:tc>
+          <w:tcPr>
+            <w:tcW w:w="0" w:type="auto"/>
+            <w:vAlign w:val="center"/>
+            <w:hideMark/>
+          </w:tcPr>
+          <w:p>
+            <w:pPr>
+              <w:spacing w:after="0" w:line="240" w:lineRule="auto"/>
+              <w:rPr>
+                <w:rFonts w:ascii="Times New Roman" w:eastAsia="Times New Roman" w:hAnsi="Times New Roman" w:cs="Times New Roman"/>
+                <w:kern w:val="0"/>
+                <w:sz w:val="24"/>
+                <w:szCs w:val="24"/>
+                <w:lang w:eastAsia="es-ES"/>
+                <w14:ligatures w14:val="none"/>
+              </w:rPr>
+            </w:pPr>
+            <w:r>
+              <w:rPr>
+                <w:rFonts w:ascii="Times New Roman" w:eastAsia="Times New Roman" w:hAnsi="Times New Roman" w:cs="Times New Roman"/>
+                <w:b/>
+                <w:bCs/>
+                <w:kern w:val="0"/>
+                <w:sz w:val="24"/>
+                <w:szCs w:val="24"/>
+                <w:lang w:eastAsia="es-ES"/>
+                <w14:ligatures w14:val="none"/>
+              </w:rPr>
+              <w:t>Estado</w:t>
+            </w:r>
+          </w:p>
+        </w:tc>
+        <w:tc>
+          <w:tcPr>
+            <w:tcW w:w="0" w:type="auto"/>
+            <w:vAlign w:val="center"/>
+            <w:hideMark/>
+          </w:tcPr>
+          <w:p>
+            <w:pPr>
+              <w:spacing w:after="0" w:line="240" w:lineRule="auto"/>
+              <w:rPr>
+                <w:rFonts w:ascii="Times New Roman" w:eastAsia="Times New Roman" w:hAnsi="Times New Roman" w:cs="Times New Roman"/>
+                <w:kern w:val="0"/>
+                <w:sz w:val="24"/>
+                <w:szCs w:val="24"/>
+                <w:lang w:eastAsia="es-ES"/>
+                <w14:ligatures w14:val="none"/>
+              </w:rPr>
+            </w:pPr>
+            <w:r>
+              <w:rPr>
+                <w:rFonts w:ascii="Times New Roman" w:eastAsia="Times New Roman" w:hAnsi="Times New Roman" w:cs="Times New Roman"/>
+                <w:b/>
+                <w:bCs/>
+                <w:kern w:val="0"/>
+                <w:sz w:val="24"/>
+                <w:szCs w:val="24"/>
+                <w:lang w:eastAsia="es-ES"/>
+                <w14:ligatures w14:val="none"/>
+              </w:rPr>
+              <w:t>APROBADO</w:t>
+            </w:r>
+          </w:p>
+        </w:tc>
+      </w:tr>
+      <w:tr>
+        <w:trPr>
+          <w:tblCellSpacing w:w="15" w:type="dxa"/>
+        </w:trPr>
+        <w:tc>
+          <w:tcPr>
+            <w:tcW w:w="0" w:type="auto"/>
+            <w:vAlign w:val="center"/>
+            <w:hideMark/>
+          </w:tcPr>
+          <w:p>
+            <w:pPr>
+              <w:spacing w:after="0" w:line="240" w:lineRule="auto"/>
+              <w:rPr>
+                <w:rFonts w:ascii="Times New Roman" w:eastAsia="Times New Roman" w:hAnsi="Times New Roman" w:cs="Times New Roman"/>
+                <w:kern w:val="0"/>
+                <w:sz w:val="24"/>
+                <w:szCs w:val="24"/>
+                <w:lang w:eastAsia="es-ES"/>
+                <w14:ligatures w14:val="none"/>
+              </w:rPr>
+            </w:pPr>
+            <w:r>
+              <w:rPr>
+                <w:rFonts w:ascii="Times New Roman" w:eastAsia="Times New Roman" w:hAnsi="Times New Roman" w:cs="Times New Roman"/>
+                <w:b/>
+                <w:bCs/>
+                <w:kern w:val="0"/>
+                <w:sz w:val="24"/>
+                <w:szCs w:val="24"/>
+                <w:lang w:eastAsia="es-ES"/>
+                <w14:ligatures w14:val="none"/>
+              </w:rPr>
+              <w:t>Evidencia</w:t>
+            </w:r>
+          </w:p>
+        </w:tc>
+        <w:tc>
+          <w:tcPr>
+            <w:tcW w:w="0" w:type="auto"/>
+            <w:vAlign w:val="center"/>
+            <w:hideMark/>
+          </w:tcPr>
+          <w:p>
+            <w:pPr>
+              <w:spacing w:after="0" w:line="240" w:lineRule="auto"/>
+              <w:rPr>
+                <w:rFonts w:ascii="Times New Roman" w:eastAsia="Times New Roman" w:hAnsi="Times New Roman" w:cs="Times New Roman"/>
+                <w:kern w:val="0"/>
+                <w:sz w:val="24"/>
+                <w:szCs w:val="24"/>
+                <w:lang w:eastAsia="es-ES"/>
+                <w14:ligatures w14:val="none"/>
+              </w:rPr>
+            </w:pPr>
+            <w:r>
+              <w:rPr>
+                <w:rFonts w:ascii="Times New Roman" w:eastAsia="Times New Roman" w:hAnsi="Times New Roman" w:cs="Times New Roman"/>
+                <w:kern w:val="0"/>
+                <w:sz w:val="24"/>
+                <w:szCs w:val="24"/>
+                <w:lang w:eastAsia="es-ES"/>
+                <w14:ligatures w14:val="none"/>
+              </w:rPr>
+              <w:t>CP-00</w:t>
+            </w:r>
+            <w:r>
+              <w:rPr>
+                <w:rFonts w:ascii="Times New Roman" w:eastAsia="Times New Roman" w:hAnsi="Times New Roman" w:cs="Times New Roman"/>
+                <w:kern w:val="0"/>
+                <w:sz w:val="24"/>
+                <w:szCs w:val="24"/>
+                <w:lang w:eastAsia="es-ES"/>
+                <w14:ligatures w14:val="none"/>
+              </w:rPr>
+              <w:t>6</w:t>
+            </w:r>
+            <w:r>
+              <w:rPr>
+                <w:rFonts w:ascii="Times New Roman" w:eastAsia="Times New Roman" w:hAnsi="Times New Roman" w:cs="Times New Roman"/>
+                <w:kern w:val="0"/>
+                <w:sz w:val="24"/>
+                <w:szCs w:val="24"/>
+                <w:lang w:eastAsia="es-ES"/>
+                <w14:ligatures w14:val="none"/>
+              </w:rPr>
+              <w:t>-cierre-sesion.png</w:t>
+            </w:r>
+          </w:p>
+        </w:tc>
+      </w:tr>
+    </w:tbl>
+    <w:p>
+      <w:pPr>
+        <w:tabs>
+          <w:tab w:val="left" w:pos="3600"/>
+        </w:tabs>
+      </w:pPr>
+    </w:p>
+    <w:p>
+      <w:pPr>
+        <w:tabs>
+          <w:tab w:val="left" w:pos="3600"/>
+        </w:tabs>
+      </w:pPr>
+    </w:p>
+    <w:p>
+      <w:pPr>
+        <w:tabs>
+          <w:tab w:val="left" w:pos="3600"/>
+        </w:tabs>
+        <w:rPr>
+          <w:noProof/>
+        </w:rPr>
+      </w:pPr>
+      <w:r>
+        <w:rPr>
+          <w:noProof/>
+        </w:rPr>
+        <w:drawing>
+          <wp:inline distT="0" distB="0" distL="0" distR="0" wp14:anchorId="72709669" wp14:editId="7056A3AC">
+            <wp:extent cx="5400040" cy="4895850"/>
+            <wp:effectExtent l="0" t="0" r="0" b="0"/>
+            <wp:docPr id="890306740" name="Imagen 2"/>
+            <wp:cNvGraphicFramePr>
+              <a:graphicFrameLocks xmlns:a="http://schemas.openxmlformats.org/drawingml/2006/main" noChangeAspect="1"/>
+            </wp:cNvGraphicFramePr>
+            <a:graphic xmlns:a="http://schemas.openxmlformats.org/drawingml/2006/main">
+              <a:graphicData uri="http://schemas.openxmlformats.org/drawingml/2006/picture">
+                <pic:pic xmlns:pic="http://schemas.openxmlformats.org/drawingml/2006/picture">
+                  <pic:nvPicPr>
+                    <pic:cNvPr id="0" name="Picture 3"/>
+                    <pic:cNvPicPr>
+                      <a:picLocks noChangeAspect="1" noChangeArrowheads="1"/>
+                    </pic:cNvPicPr>
+                  </pic:nvPicPr>
+                  <pic:blipFill>
+                    <a:blip r:embed="rId11">
+                      <a:extLst>
+                        <a:ext uri="{28A0092B-C50C-407E-A947-70E740481C1C}">
+                          <a14:useLocalDpi xmlns:a14="http://schemas.microsoft.com/office/drawing/2010/main" val="0"/>
+                        </a:ext>
+                      </a:extLst>
+                    </a:blip>
+                    <a:srcRect/>
+                    <a:stretch>
+                      <a:fillRect/>
+                    </a:stretch>
+                  </pic:blipFill>
+                  <pic:spPr bwMode="auto">
+                    <a:xfrm>
+                      <a:off x="0" y="0"/>
+                      <a:ext cx="5400040" cy="4895850"/>
+                    </a:xfrm>
+                    <a:prstGeom prst="rect">
+                      <a:avLst/>
+                    </a:prstGeom>
+                    <a:noFill/>
+                    <a:ln>
+                      <a:noFill/>
+                    </a:ln>
+                  </pic:spPr>
+                </pic:pic>
+              </a:graphicData>
+            </a:graphic>
+          </wp:inline>
+        </w:drawing>
+      </w:r>
+    </w:p>
+    <w:p/>
+    <w:p/>
+    <w:p/>
+    <w:p>
+      <w:pPr>
+        <w:rPr>
+          <w:noProof/>
+        </w:rPr>
+      </w:pPr>
+    </w:p>
+    <w:p>
+      <w:pPr>
+        <w:tabs>
+          <w:tab w:val="left" w:pos="3190"/>
+        </w:tabs>
+      </w:pPr>
+      <w:r>
+        <w:tab/>
+      </w:r>
+    </w:p>
+    <w:tbl>
+      <w:tblPr>
+        <w:tblW w:w="0" w:type="auto"/>
+        <w:tblCellSpacing w:w="15" w:type="dxa"/>
+        <w:tblBorders>
+          <w:top w:val="single" w:sz="4" w:space="0" w:color="auto"/>
+          <w:left w:val="single" w:sz="4" w:space="0" w:color="auto"/>
+          <w:bottom w:val="single" w:sz="4" w:space="0" w:color="auto"/>
+          <w:right w:val="single" w:sz="4" w:space="0" w:color="auto"/>
+          <w:insideH w:val="single" w:sz="4" w:space="0" w:color="auto"/>
+          <w:insideV w:val="single" w:sz="4" w:space="0" w:color="auto"/>
+        </w:tblBorders>
+        <w:tblCellMar>
+          <w:top w:w="15" w:type="dxa"/>
+          <w:left w:w="15" w:type="dxa"/>
+          <w:bottom w:w="15" w:type="dxa"/>
+          <w:right w:w="15" w:type="dxa"/>
+        </w:tblCellMar>
+        <w:tblLook w:val="04A0" w:firstRow="1" w:lastRow="0" w:firstColumn="1" w:lastColumn="0" w:noHBand="0" w:noVBand="1"/>
+      </w:tblPr>
+      <w:tblGrid>
+        <w:gridCol w:w="1831"/>
+        <w:gridCol w:w="6663"/>
+      </w:tblGrid>
+      <w:tr>
+        <w:trPr>
+          <w:tblHeader/>
+          <w:tblCellSpacing w:w="15" w:type="dxa"/>
+        </w:trPr>
+        <w:tc>
+          <w:tcPr>
+            <w:tcW w:w="0" w:type="auto"/>
+            <w:vAlign w:val="center"/>
+            <w:hideMark/>
+          </w:tcPr>
+          <w:p>
+            <w:pPr>
+              <w:spacing w:after="0" w:line="240" w:lineRule="auto"/>
+              <w:jc w:val="center"/>
+              <w:rPr>
+                <w:rFonts w:ascii="Times New Roman" w:eastAsia="Times New Roman" w:hAnsi="Times New Roman" w:cs="Times New Roman"/>
+                <w:b/>
+                <w:bCs/>
+                <w:kern w:val="0"/>
+                <w:sz w:val="24"/>
+                <w:szCs w:val="24"/>
+                <w:lang w:eastAsia="es-ES"/>
+                <w14:ligatures w14:val="none"/>
+              </w:rPr>
+            </w:pPr>
+            <w:r>
+              <w:rPr>
+                <w:rFonts w:ascii="Times New Roman" w:eastAsia="Times New Roman" w:hAnsi="Times New Roman" w:cs="Times New Roman"/>
+                <w:b/>
+                <w:bCs/>
+                <w:kern w:val="0"/>
+                <w:sz w:val="24"/>
+                <w:szCs w:val="24"/>
+                <w:lang w:eastAsia="es-ES"/>
+                <w14:ligatures w14:val="none"/>
+              </w:rPr>
+              <w:t>Campo</w:t>
+            </w:r>
+          </w:p>
+        </w:tc>
+        <w:tc>
+          <w:tcPr>
+            <w:tcW w:w="0" w:type="auto"/>
+            <w:vAlign w:val="center"/>
+            <w:hideMark/>
+          </w:tcPr>
+          <w:p>
+            <w:pPr>
+              <w:spacing w:after="0" w:line="240" w:lineRule="auto"/>
+              <w:jc w:val="center"/>
+              <w:rPr>
+                <w:rFonts w:ascii="Times New Roman" w:eastAsia="Times New Roman" w:hAnsi="Times New Roman" w:cs="Times New Roman"/>
+                <w:b/>
+                <w:bCs/>
+                <w:kern w:val="0"/>
+                <w:sz w:val="24"/>
+                <w:szCs w:val="24"/>
+                <w:lang w:eastAsia="es-ES"/>
+                <w14:ligatures w14:val="none"/>
+              </w:rPr>
+            </w:pPr>
+            <w:r>
+              <w:rPr>
+                <w:rFonts w:ascii="Times New Roman" w:eastAsia="Times New Roman" w:hAnsi="Times New Roman" w:cs="Times New Roman"/>
+                <w:b/>
+                <w:bCs/>
+                <w:kern w:val="0"/>
+                <w:sz w:val="24"/>
+                <w:szCs w:val="24"/>
+                <w:lang w:eastAsia="es-ES"/>
+                <w14:ligatures w14:val="none"/>
+              </w:rPr>
+              <w:t>Información</w:t>
+            </w:r>
+          </w:p>
+        </w:tc>
+      </w:tr>
+      <w:tr>
+        <w:trPr>
+          <w:tblCellSpacing w:w="15" w:type="dxa"/>
+        </w:trPr>
+        <w:tc>
+          <w:tcPr>
+            <w:tcW w:w="0" w:type="auto"/>
+            <w:vAlign w:val="center"/>
+            <w:hideMark/>
+          </w:tcPr>
+          <w:p>
+            <w:pPr>
+              <w:spacing w:after="0" w:line="240" w:lineRule="auto"/>
+              <w:rPr>
+                <w:rFonts w:ascii="Times New Roman" w:eastAsia="Times New Roman" w:hAnsi="Times New Roman" w:cs="Times New Roman"/>
+                <w:kern w:val="0"/>
+                <w:sz w:val="24"/>
+                <w:szCs w:val="24"/>
+                <w:lang w:eastAsia="es-ES"/>
+                <w14:ligatures w14:val="none"/>
+              </w:rPr>
+            </w:pPr>
+            <w:r>
+              <w:rPr>
+                <w:rFonts w:ascii="Times New Roman" w:eastAsia="Times New Roman" w:hAnsi="Times New Roman" w:cs="Times New Roman"/>
+                <w:b/>
+                <w:bCs/>
+                <w:kern w:val="0"/>
+                <w:sz w:val="24"/>
+                <w:szCs w:val="24"/>
+                <w:lang w:eastAsia="es-ES"/>
+                <w14:ligatures w14:val="none"/>
+              </w:rPr>
+              <w:t>Caso de prueba</w:t>
+            </w:r>
+          </w:p>
+        </w:tc>
+        <w:tc>
+          <w:tcPr>
+            <w:tcW w:w="0" w:type="auto"/>
+            <w:vAlign w:val="center"/>
+            <w:hideMark/>
+          </w:tcPr>
+          <w:p>
+            <w:pPr>
+              <w:spacing w:after="0" w:line="240" w:lineRule="auto"/>
+              <w:rPr>
+                <w:rFonts w:ascii="Times New Roman" w:eastAsia="Times New Roman" w:hAnsi="Times New Roman" w:cs="Times New Roman"/>
+                <w:kern w:val="0"/>
+                <w:sz w:val="24"/>
+                <w:szCs w:val="24"/>
+                <w:lang w:eastAsia="es-ES"/>
+                <w14:ligatures w14:val="none"/>
+              </w:rPr>
+            </w:pPr>
+            <w:r>
+              <w:rPr>
+                <w:rFonts w:ascii="Times New Roman" w:eastAsia="Times New Roman" w:hAnsi="Times New Roman" w:cs="Times New Roman"/>
+                <w:kern w:val="0"/>
+                <w:sz w:val="24"/>
+                <w:szCs w:val="24"/>
+                <w:lang w:eastAsia="es-ES"/>
+                <w14:ligatures w14:val="none"/>
+              </w:rPr>
+              <w:t>CP-00</w:t>
+            </w:r>
+            <w:r>
+              <w:rPr>
+                <w:rFonts w:ascii="Times New Roman" w:eastAsia="Times New Roman" w:hAnsi="Times New Roman" w:cs="Times New Roman"/>
+                <w:kern w:val="0"/>
+                <w:sz w:val="24"/>
+                <w:szCs w:val="24"/>
+                <w:lang w:eastAsia="es-ES"/>
+                <w14:ligatures w14:val="none"/>
+              </w:rPr>
+              <w:t>7</w:t>
+            </w:r>
+          </w:p>
+        </w:tc>
+      </w:tr>
+      <w:tr>
+        <w:trPr>
+          <w:tblCellSpacing w:w="15" w:type="dxa"/>
+        </w:trPr>
+        <w:tc>
+          <w:tcPr>
+            <w:tcW w:w="0" w:type="auto"/>
+            <w:vAlign w:val="center"/>
+            <w:hideMark/>
+          </w:tcPr>
+          <w:p>
+            <w:pPr>
+              <w:spacing w:after="0" w:line="240" w:lineRule="auto"/>
+              <w:rPr>
+                <w:rFonts w:ascii="Times New Roman" w:eastAsia="Times New Roman" w:hAnsi="Times New Roman" w:cs="Times New Roman"/>
+                <w:kern w:val="0"/>
+                <w:sz w:val="24"/>
+                <w:szCs w:val="24"/>
+                <w:lang w:eastAsia="es-ES"/>
+                <w14:ligatures w14:val="none"/>
+              </w:rPr>
+            </w:pPr>
+            <w:r>
+              <w:rPr>
+                <w:rFonts w:ascii="Times New Roman" w:eastAsia="Times New Roman" w:hAnsi="Times New Roman" w:cs="Times New Roman"/>
+                <w:b/>
+                <w:bCs/>
+                <w:kern w:val="0"/>
+                <w:sz w:val="24"/>
+                <w:szCs w:val="24"/>
+                <w:lang w:eastAsia="es-ES"/>
+                <w14:ligatures w14:val="none"/>
+              </w:rPr>
+              <w:t>Funcionalidad</w:t>
+            </w:r>
+          </w:p>
+        </w:tc>
+        <w:tc>
+          <w:tcPr>
+            <w:tcW w:w="0" w:type="auto"/>
+            <w:vAlign w:val="center"/>
+            <w:hideMark/>
+          </w:tcPr>
+          <w:p>
+            <w:pPr>
+              <w:spacing w:after="0" w:line="240" w:lineRule="auto"/>
+              <w:rPr>
+                <w:rFonts w:ascii="Times New Roman" w:eastAsia="Times New Roman" w:hAnsi="Times New Roman" w:cs="Times New Roman"/>
+                <w:kern w:val="0"/>
+                <w:sz w:val="24"/>
+                <w:szCs w:val="24"/>
+                <w:lang w:eastAsia="es-ES"/>
+                <w14:ligatures w14:val="none"/>
+              </w:rPr>
+            </w:pPr>
+            <w:r>
+              <w:rPr>
+                <w:rFonts w:ascii="Times New Roman" w:eastAsia="Times New Roman" w:hAnsi="Times New Roman" w:cs="Times New Roman"/>
+                <w:kern w:val="0"/>
+                <w:sz w:val="24"/>
+                <w:szCs w:val="24"/>
+                <w:lang w:eastAsia="es-ES"/>
+                <w14:ligatures w14:val="none"/>
+              </w:rPr>
+              <w:t>Protección del panel después de cerrar sesión</w:t>
+            </w:r>
+          </w:p>
+        </w:tc>
+      </w:tr>
+      <w:tr>
+        <w:trPr>
+          <w:tblCellSpacing w:w="15" w:type="dxa"/>
+        </w:trPr>
+        <w:tc>
+          <w:tcPr>
+            <w:tcW w:w="0" w:type="auto"/>
+            <w:vAlign w:val="center"/>
+            <w:hideMark/>
+          </w:tcPr>
+          <w:p>
+            <w:pPr>
+              <w:spacing w:after="0" w:line="240" w:lineRule="auto"/>
+              <w:rPr>
+                <w:rFonts w:ascii="Times New Roman" w:eastAsia="Times New Roman" w:hAnsi="Times New Roman" w:cs="Times New Roman"/>
+                <w:kern w:val="0"/>
+                <w:sz w:val="24"/>
+                <w:szCs w:val="24"/>
+                <w:lang w:eastAsia="es-ES"/>
+                <w14:ligatures w14:val="none"/>
+              </w:rPr>
+            </w:pPr>
+            <w:r>
+              <w:rPr>
+                <w:rFonts w:ascii="Times New Roman" w:eastAsia="Times New Roman" w:hAnsi="Times New Roman" w:cs="Times New Roman"/>
+                <w:b/>
+                <w:bCs/>
+                <w:kern w:val="0"/>
+                <w:sz w:val="24"/>
+                <w:szCs w:val="24"/>
+                <w:lang w:eastAsia="es-ES"/>
+                <w14:ligatures w14:val="none"/>
+              </w:rPr>
+              <w:t>Resultado esperado</w:t>
+            </w:r>
+          </w:p>
+        </w:tc>
+        <w:tc>
+          <w:tcPr>
+            <w:tcW w:w="0" w:type="auto"/>
+            <w:vAlign w:val="center"/>
+            <w:hideMark/>
+          </w:tcPr>
+          <w:p>
+            <w:pPr>
+              <w:spacing w:after="0" w:line="240" w:lineRule="auto"/>
+              <w:rPr>
+                <w:rFonts w:ascii="Times New Roman" w:eastAsia="Times New Roman" w:hAnsi="Times New Roman" w:cs="Times New Roman"/>
+                <w:kern w:val="0"/>
+                <w:sz w:val="24"/>
+                <w:szCs w:val="24"/>
+                <w:lang w:eastAsia="es-ES"/>
+                <w14:ligatures w14:val="none"/>
+              </w:rPr>
+            </w:pPr>
+            <w:r>
+              <w:rPr>
+                <w:rFonts w:ascii="Times New Roman" w:eastAsia="Times New Roman" w:hAnsi="Times New Roman" w:cs="Times New Roman"/>
+                <w:kern w:val="0"/>
+                <w:sz w:val="24"/>
+                <w:szCs w:val="24"/>
+                <w:lang w:eastAsia="es-ES"/>
+                <w14:ligatures w14:val="none"/>
+              </w:rPr>
+              <w:t>Después de cerrar sesión, el usuario no debe poder acceder nuevamente al panel administrativo sin autenticarse.</w:t>
+            </w:r>
+          </w:p>
+        </w:tc>
+      </w:tr>
+      <w:tr>
+        <w:trPr>
+          <w:tblCellSpacing w:w="15" w:type="dxa"/>
+        </w:trPr>
+        <w:tc>
+          <w:tcPr>
+            <w:tcW w:w="0" w:type="auto"/>
+            <w:vAlign w:val="center"/>
+            <w:hideMark/>
+          </w:tcPr>
+          <w:p>
+            <w:pPr>
+              <w:spacing w:after="0" w:line="240" w:lineRule="auto"/>
+              <w:rPr>
+                <w:rFonts w:ascii="Times New Roman" w:eastAsia="Times New Roman" w:hAnsi="Times New Roman" w:cs="Times New Roman"/>
+                <w:kern w:val="0"/>
+                <w:sz w:val="24"/>
+                <w:szCs w:val="24"/>
+                <w:lang w:eastAsia="es-ES"/>
+                <w14:ligatures w14:val="none"/>
+              </w:rPr>
+            </w:pPr>
+            <w:r>
+              <w:rPr>
+                <w:rFonts w:ascii="Times New Roman" w:eastAsia="Times New Roman" w:hAnsi="Times New Roman" w:cs="Times New Roman"/>
+                <w:b/>
+                <w:bCs/>
+                <w:kern w:val="0"/>
+                <w:sz w:val="24"/>
+                <w:szCs w:val="24"/>
+                <w:lang w:eastAsia="es-ES"/>
+                <w14:ligatures w14:val="none"/>
+              </w:rPr>
+              <w:t>Resultado obtenido</w:t>
+            </w:r>
+          </w:p>
+        </w:tc>
+        <w:tc>
+          <w:tcPr>
+            <w:tcW w:w="0" w:type="auto"/>
+            <w:vAlign w:val="center"/>
+            <w:hideMark/>
+          </w:tcPr>
+          <w:p>
+            <w:pPr>
+              <w:spacing w:after="0" w:line="240" w:lineRule="auto"/>
+              <w:rPr>
+                <w:rFonts w:ascii="Times New Roman" w:eastAsia="Times New Roman" w:hAnsi="Times New Roman" w:cs="Times New Roman"/>
+                <w:kern w:val="0"/>
+                <w:sz w:val="24"/>
+                <w:szCs w:val="24"/>
+                <w:lang w:eastAsia="es-ES"/>
+                <w14:ligatures w14:val="none"/>
+              </w:rPr>
+            </w:pPr>
+            <w:r>
+              <w:rPr>
+                <w:rFonts w:ascii="Times New Roman" w:eastAsia="Times New Roman" w:hAnsi="Times New Roman" w:cs="Times New Roman"/>
+                <w:kern w:val="0"/>
+                <w:sz w:val="24"/>
+                <w:szCs w:val="24"/>
+                <w:lang w:eastAsia="es-ES"/>
+                <w14:ligatures w14:val="none"/>
+              </w:rPr>
+              <w:t xml:space="preserve">Al intentar acceder nuevamente a </w:t>
+            </w:r>
+            <w:r>
+              <w:rPr>
+                <w:rFonts w:ascii="Courier New" w:eastAsia="Times New Roman" w:hAnsi="Courier New" w:cs="Courier New"/>
+                <w:kern w:val="0"/>
+                <w:sz w:val="20"/>
+                <w:szCs w:val="20"/>
+                <w:lang w:eastAsia="es-ES"/>
+                <w14:ligatures w14:val="none"/>
+              </w:rPr>
+              <w:t>/</w:t>
+            </w:r>
+            <w:proofErr w:type="spellStart"/>
+            <w:r>
+              <w:rPr>
+                <w:rFonts w:ascii="Courier New" w:eastAsia="Times New Roman" w:hAnsi="Courier New" w:cs="Courier New"/>
+                <w:kern w:val="0"/>
+                <w:sz w:val="20"/>
+                <w:szCs w:val="20"/>
+                <w:lang w:eastAsia="es-ES"/>
+                <w14:ligatures w14:val="none"/>
+              </w:rPr>
+              <w:t>admin</w:t>
+            </w:r>
+            <w:proofErr w:type="spellEnd"/>
+            <w:r>
+              <w:rPr>
+                <w:rFonts w:ascii="Courier New" w:eastAsia="Times New Roman" w:hAnsi="Courier New" w:cs="Courier New"/>
+                <w:kern w:val="0"/>
+                <w:sz w:val="20"/>
+                <w:szCs w:val="20"/>
+                <w:lang w:eastAsia="es-ES"/>
+                <w14:ligatures w14:val="none"/>
+              </w:rPr>
+              <w:t>/</w:t>
+            </w:r>
+            <w:r>
+              <w:rPr>
+                <w:rFonts w:ascii="Times New Roman" w:eastAsia="Times New Roman" w:hAnsi="Times New Roman" w:cs="Times New Roman"/>
+                <w:kern w:val="0"/>
+                <w:sz w:val="24"/>
+                <w:szCs w:val="24"/>
+                <w:lang w:eastAsia="es-ES"/>
+                <w14:ligatures w14:val="none"/>
+              </w:rPr>
+              <w:t>, el sistema mostró el formulario de inicio de sesión y no permitió acceder al panel.</w:t>
+            </w:r>
+          </w:p>
+        </w:tc>
+      </w:tr>
+      <w:tr>
+        <w:trPr>
+          <w:tblCellSpacing w:w="15" w:type="dxa"/>
+        </w:trPr>
+        <w:tc>
+          <w:tcPr>
+            <w:tcW w:w="0" w:type="auto"/>
+            <w:vAlign w:val="center"/>
+            <w:hideMark/>
+          </w:tcPr>
+          <w:p>
+            <w:pPr>
+              <w:spacing w:after="0" w:line="240" w:lineRule="auto"/>
+              <w:rPr>
+                <w:rFonts w:ascii="Times New Roman" w:eastAsia="Times New Roman" w:hAnsi="Times New Roman" w:cs="Times New Roman"/>
+                <w:kern w:val="0"/>
+                <w:sz w:val="24"/>
+                <w:szCs w:val="24"/>
+                <w:lang w:eastAsia="es-ES"/>
+                <w14:ligatures w14:val="none"/>
+              </w:rPr>
+            </w:pPr>
+            <w:r>
+              <w:rPr>
+                <w:rFonts w:ascii="Times New Roman" w:eastAsia="Times New Roman" w:hAnsi="Times New Roman" w:cs="Times New Roman"/>
+                <w:b/>
+                <w:bCs/>
+                <w:kern w:val="0"/>
+                <w:sz w:val="24"/>
+                <w:szCs w:val="24"/>
+                <w:lang w:eastAsia="es-ES"/>
+                <w14:ligatures w14:val="none"/>
+              </w:rPr>
+              <w:t>Estado</w:t>
+            </w:r>
+          </w:p>
+        </w:tc>
+        <w:tc>
+          <w:tcPr>
+            <w:tcW w:w="0" w:type="auto"/>
+            <w:vAlign w:val="center"/>
+            <w:hideMark/>
+          </w:tcPr>
+          <w:p>
+            <w:pPr>
+              <w:spacing w:after="0" w:line="240" w:lineRule="auto"/>
+              <w:rPr>
+                <w:rFonts w:ascii="Times New Roman" w:eastAsia="Times New Roman" w:hAnsi="Times New Roman" w:cs="Times New Roman"/>
+                <w:kern w:val="0"/>
+                <w:sz w:val="24"/>
+                <w:szCs w:val="24"/>
+                <w:lang w:eastAsia="es-ES"/>
+                <w14:ligatures w14:val="none"/>
+              </w:rPr>
+            </w:pPr>
+            <w:r>
+              <w:rPr>
+                <w:rFonts w:ascii="Times New Roman" w:eastAsia="Times New Roman" w:hAnsi="Times New Roman" w:cs="Times New Roman"/>
+                <w:b/>
+                <w:bCs/>
+                <w:kern w:val="0"/>
+                <w:sz w:val="24"/>
+                <w:szCs w:val="24"/>
+                <w:lang w:eastAsia="es-ES"/>
+                <w14:ligatures w14:val="none"/>
+              </w:rPr>
+              <w:t>APROBADO</w:t>
+            </w:r>
+          </w:p>
+        </w:tc>
+      </w:tr>
+      <w:tr>
+        <w:trPr>
+          <w:tblCellSpacing w:w="15" w:type="dxa"/>
+        </w:trPr>
+        <w:tc>
+          <w:tcPr>
+            <w:tcW w:w="0" w:type="auto"/>
+            <w:vAlign w:val="center"/>
+            <w:hideMark/>
+          </w:tcPr>
+          <w:p>
+            <w:pPr>
+              <w:spacing w:after="0" w:line="240" w:lineRule="auto"/>
+              <w:rPr>
+                <w:rFonts w:ascii="Times New Roman" w:eastAsia="Times New Roman" w:hAnsi="Times New Roman" w:cs="Times New Roman"/>
+                <w:kern w:val="0"/>
+                <w:sz w:val="24"/>
+                <w:szCs w:val="24"/>
+                <w:lang w:eastAsia="es-ES"/>
+                <w14:ligatures w14:val="none"/>
+              </w:rPr>
+            </w:pPr>
+            <w:r>
+              <w:rPr>
+                <w:rFonts w:ascii="Times New Roman" w:eastAsia="Times New Roman" w:hAnsi="Times New Roman" w:cs="Times New Roman"/>
+                <w:b/>
+                <w:bCs/>
+                <w:kern w:val="0"/>
+                <w:sz w:val="24"/>
+                <w:szCs w:val="24"/>
+                <w:lang w:eastAsia="es-ES"/>
+                <w14:ligatures w14:val="none"/>
+              </w:rPr>
+              <w:t>Evidencia</w:t>
+            </w:r>
+          </w:p>
+        </w:tc>
+        <w:tc>
+          <w:tcPr>
+            <w:tcW w:w="0" w:type="auto"/>
+            <w:vAlign w:val="center"/>
+            <w:hideMark/>
+          </w:tcPr>
+          <w:p>
+            <w:pPr>
+              <w:spacing w:after="0" w:line="240" w:lineRule="auto"/>
+              <w:rPr>
+                <w:rFonts w:ascii="Times New Roman" w:eastAsia="Times New Roman" w:hAnsi="Times New Roman" w:cs="Times New Roman"/>
+                <w:kern w:val="0"/>
+                <w:sz w:val="24"/>
+                <w:szCs w:val="24"/>
+                <w:lang w:eastAsia="es-ES"/>
+                <w14:ligatures w14:val="none"/>
+              </w:rPr>
+            </w:pPr>
+            <w:r>
+              <w:rPr>
+                <w:rFonts w:ascii="Times New Roman" w:eastAsia="Times New Roman" w:hAnsi="Times New Roman" w:cs="Times New Roman"/>
+                <w:kern w:val="0"/>
+                <w:sz w:val="24"/>
+                <w:szCs w:val="24"/>
+                <w:lang w:eastAsia="es-ES"/>
+                <w14:ligatures w14:val="none"/>
+              </w:rPr>
+              <w:t>CP-00</w:t>
+            </w:r>
+            <w:r>
+              <w:rPr>
+                <w:rFonts w:ascii="Times New Roman" w:eastAsia="Times New Roman" w:hAnsi="Times New Roman" w:cs="Times New Roman"/>
+                <w:kern w:val="0"/>
+                <w:sz w:val="24"/>
+                <w:szCs w:val="24"/>
+                <w:lang w:eastAsia="es-ES"/>
+                <w14:ligatures w14:val="none"/>
+              </w:rPr>
+              <w:t>7</w:t>
+            </w:r>
+            <w:r>
+              <w:rPr>
+                <w:rFonts w:ascii="Times New Roman" w:eastAsia="Times New Roman" w:hAnsi="Times New Roman" w:cs="Times New Roman"/>
+                <w:kern w:val="0"/>
+                <w:sz w:val="24"/>
+                <w:szCs w:val="24"/>
+                <w:lang w:eastAsia="es-ES"/>
+                <w14:ligatures w14:val="none"/>
+              </w:rPr>
+              <w:t>-acceso-despues-de-cerrar-sesion.png</w:t>
+            </w:r>
+          </w:p>
+        </w:tc>
+      </w:tr>
+    </w:tbl>
+    <w:p>
+      <w:pPr>
+        <w:tabs>
+          <w:tab w:val="left" w:pos="3190"/>
+        </w:tabs>
+      </w:pPr>
+    </w:p>
+    <w:p>
+      <w:pPr>
+        <w:tabs>
+          <w:tab w:val="left" w:pos="3190"/>
+        </w:tabs>
+      </w:pPr>
+      <w:r>
+        <w:rPr>
+          <w:noProof/>
+          <w:u w:val="single"/>
+        </w:rPr>
+        <w:lastRenderedPageBreak/>
+        <w:drawing>
+          <wp:inline distT="0" distB="0" distL="0" distR="0" wp14:anchorId="67CD504F" wp14:editId="4920F0E0">
+            <wp:extent cx="5400040" cy="2694305"/>
+            <wp:effectExtent l="0" t="0" r="0" b="0"/>
+            <wp:docPr id="1408583365" name="Imagen 3"/>
+            <wp:cNvGraphicFramePr>
+              <a:graphicFrameLocks xmlns:a="http://schemas.openxmlformats.org/drawingml/2006/main" noChangeAspect="1"/>
+            </wp:cNvGraphicFramePr>
+            <a:graphic xmlns:a="http://schemas.openxmlformats.org/drawingml/2006/main">
+              <a:graphicData uri="http://schemas.openxmlformats.org/drawingml/2006/picture">
+                <pic:pic xmlns:pic="http://schemas.openxmlformats.org/drawingml/2006/picture">
+                  <pic:nvPicPr>
+                    <pic:cNvPr id="0" name="Picture 5"/>
                     <pic:cNvPicPr>
                       <a:picLocks noChangeAspect="1" noChangeArrowheads="1"/>
                     </pic:cNvPicPr>
@@ -3075,6 +5107,25 @@
     <w:uiPriority w:val="99"/>
     <w:rsid w:val="003B774B"/>
   </w:style>
+  <w:style w:type="paragraph" w:styleId="NormalWeb">
+    <w:name w:val="Normal (Web)"/>
+    <w:basedOn w:val="Normal"/>
+    <w:uiPriority w:val="99"/>
+    <w:semiHidden/>
+    <w:unhideWhenUsed/>
+    <w:rsid w:val="00C26C4D"/>
+    <w:pPr>
+      <w:spacing w:before="100" w:beforeAutospacing="1" w:after="100" w:afterAutospacing="1" w:line="240" w:lineRule="auto"/>
+    </w:pPr>
+    <w:rPr>
+      <w:rFonts w:ascii="Times New Roman" w:eastAsia="Times New Roman" w:hAnsi="Times New Roman" w:cs="Times New Roman"/>
+      <w:kern w:val="0"/>
+      <w:sz w:val="24"/>
+      <w:szCs w:val="24"/>
+      <w:lang w:eastAsia="es-ES"/>
+      <w14:ligatures w14:val="none"/>
+    </w:rPr>
+  </w:style>
 </w:styles>
 </file>
 

</xml_diff>